<commit_message>
Correction du budget initial
Précision sur l’accès institutionnel aux normes, correction du nom du projet et clarification de la conclusion budgétaire. Budget de référence maintenu à 46 200 $.
</commit_message>
<xml_diff>
--- a/Budget_IMP_II_F.docx
+++ b/Budget_IMP_II_F.docx
@@ -66,12 +66,6 @@
         <w:gridCol w:w="1500"/>
       </w:tblGrid>
       <w:tr>
-        <w:tblPrEx>
-          <w:tblCellMar>
-            <w:top w:w="0" w:type="dxa"/>
-            <w:bottom w:w="0" w:type="dxa"/>
-          </w:tblCellMar>
-        </w:tblPrEx>
         <w:tc>
           <w:tcPr>
             <w:tcW w:w="2600" w:type="dxa"/>
@@ -121,7 +115,7 @@
                 <w:sz w:val="18"/>
                 <w:szCs w:val="18"/>
               </w:rPr>
-              <w:t>thermo hydraulique</w:t>
+              <w:t>thermohydraulique</w:t>
             </w:r>
             <w:r>
               <w:rPr>
@@ -129,18 +123,12 @@
                 <w:sz w:val="18"/>
                 <w:szCs w:val="18"/>
               </w:rPr>
-              <w:t xml:space="preserve"> (</w:t>
+              <w:t xml:space="preserve"> </w:t>
             </w:r>
           </w:p>
         </w:tc>
       </w:tr>
       <w:tr>
-        <w:tblPrEx>
-          <w:tblCellMar>
-            <w:top w:w="0" w:type="dxa"/>
-            <w:bottom w:w="0" w:type="dxa"/>
-          </w:tblCellMar>
-        </w:tblPrEx>
         <w:tc>
           <w:tcPr>
             <w:tcW w:w="2600" w:type="dxa"/>
@@ -188,12 +176,6 @@
         </w:tc>
       </w:tr>
       <w:tr>
-        <w:tblPrEx>
-          <w:tblCellMar>
-            <w:top w:w="0" w:type="dxa"/>
-            <w:bottom w:w="0" w:type="dxa"/>
-          </w:tblCellMar>
-        </w:tblPrEx>
         <w:tc>
           <w:tcPr>
             <w:tcW w:w="2600" w:type="dxa"/>
@@ -232,12 +214,6 @@
         </w:tc>
       </w:tr>
       <w:tr>
-        <w:tblPrEx>
-          <w:tblCellMar>
-            <w:top w:w="0" w:type="dxa"/>
-            <w:bottom w:w="0" w:type="dxa"/>
-          </w:tblCellMar>
-        </w:tblPrEx>
         <w:tc>
           <w:tcPr>
             <w:tcW w:w="2600" w:type="dxa"/>
@@ -314,12 +290,6 @@
         </w:tc>
       </w:tr>
       <w:tr>
-        <w:tblPrEx>
-          <w:tblCellMar>
-            <w:top w:w="0" w:type="dxa"/>
-            <w:bottom w:w="0" w:type="dxa"/>
-          </w:tblCellMar>
-        </w:tblPrEx>
         <w:tc>
           <w:tcPr>
             <w:tcW w:w="2600" w:type="dxa"/>
@@ -413,6 +383,15 @@
         </w:rPr>
         <w:t>• Aucun coût matériel, logiciel ou normatif direct : le projet est un livrable logiciel et s'appuie entièrement sur les ressources de l'UQAC.</w:t>
       </w:r>
+      <w:r>
+        <w:t xml:space="preserve"> </w:t>
+      </w:r>
+      <w:r>
+        <w:rPr>
+          <w:color w:val="000000"/>
+        </w:rPr>
+        <w:t>Aucun coût normatif direct n'est actuellement prévu, sous l'hypothèse que les documents nécessaires sont accessibles par les ressources institutionnelles de l'UQAC. Si certains documents ne sont pas disponibles par accès institutionnel, leur acquisition devra être réévaluée ou leur utilisation limitée aux informations publiques autorisées.</w:t>
+      </w:r>
     </w:p>
     <w:p>
       <w:pPr>
@@ -456,12 +435,6 @@
         <w:gridCol w:w="1200"/>
       </w:tblGrid>
       <w:tr>
-        <w:tblPrEx>
-          <w:tblCellMar>
-            <w:top w:w="0" w:type="dxa"/>
-            <w:bottom w:w="0" w:type="dxa"/>
-          </w:tblCellMar>
-        </w:tblPrEx>
         <w:tc>
           <w:tcPr>
             <w:tcW w:w="1250" w:type="dxa"/>
@@ -589,12 +562,6 @@
         </w:tc>
       </w:tr>
       <w:tr>
-        <w:tblPrEx>
-          <w:tblCellMar>
-            <w:top w:w="0" w:type="dxa"/>
-            <w:bottom w:w="0" w:type="dxa"/>
-          </w:tblCellMar>
-        </w:tblPrEx>
         <w:tc>
           <w:tcPr>
             <w:tcW w:w="1250" w:type="dxa"/>
@@ -618,6 +585,16 @@
               </w:rPr>
               <w:t>Coûts direct</w:t>
             </w:r>
+            <w:r>
+              <w:rPr>
+                <w:b/>
+                <w:bCs/>
+                <w:color w:val="000000"/>
+                <w:sz w:val="17"/>
+                <w:szCs w:val="17"/>
+              </w:rPr>
+              <w:t>s</w:t>
+            </w:r>
           </w:p>
         </w:tc>
         <w:tc>
@@ -691,12 +668,6 @@
         </w:tc>
       </w:tr>
       <w:tr>
-        <w:tblPrEx>
-          <w:tblCellMar>
-            <w:top w:w="0" w:type="dxa"/>
-            <w:bottom w:w="0" w:type="dxa"/>
-          </w:tblCellMar>
-        </w:tblPrEx>
         <w:tc>
           <w:tcPr>
             <w:tcW w:w="1250" w:type="dxa"/>
@@ -801,12 +772,6 @@
         </w:tc>
       </w:tr>
       <w:tr>
-        <w:tblPrEx>
-          <w:tblCellMar>
-            <w:top w:w="0" w:type="dxa"/>
-            <w:bottom w:w="0" w:type="dxa"/>
-          </w:tblCellMar>
-        </w:tblPrEx>
         <w:tc>
           <w:tcPr>
             <w:tcW w:w="1250" w:type="dxa"/>
@@ -911,12 +876,6 @@
         </w:tc>
       </w:tr>
       <w:tr>
-        <w:tblPrEx>
-          <w:tblCellMar>
-            <w:top w:w="0" w:type="dxa"/>
-            <w:bottom w:w="0" w:type="dxa"/>
-          </w:tblCellMar>
-        </w:tblPrEx>
         <w:tc>
           <w:tcPr>
             <w:tcW w:w="1250" w:type="dxa"/>
@@ -1021,12 +980,6 @@
         </w:tc>
       </w:tr>
       <w:tr>
-        <w:tblPrEx>
-          <w:tblCellMar>
-            <w:top w:w="0" w:type="dxa"/>
-            <w:bottom w:w="0" w:type="dxa"/>
-          </w:tblCellMar>
-        </w:tblPrEx>
         <w:tc>
           <w:tcPr>
             <w:tcW w:w="1250" w:type="dxa"/>
@@ -1131,12 +1084,6 @@
         </w:tc>
       </w:tr>
       <w:tr>
-        <w:tblPrEx>
-          <w:tblCellMar>
-            <w:top w:w="0" w:type="dxa"/>
-            <w:bottom w:w="0" w:type="dxa"/>
-          </w:tblCellMar>
-        </w:tblPrEx>
         <w:tc>
           <w:tcPr>
             <w:tcW w:w="1250" w:type="dxa"/>
@@ -1241,12 +1188,6 @@
         </w:tc>
       </w:tr>
       <w:tr>
-        <w:tblPrEx>
-          <w:tblCellMar>
-            <w:top w:w="0" w:type="dxa"/>
-            <w:bottom w:w="0" w:type="dxa"/>
-          </w:tblCellMar>
-        </w:tblPrEx>
         <w:tc>
           <w:tcPr>
             <w:tcW w:w="1250" w:type="dxa"/>
@@ -1351,12 +1292,6 @@
         </w:tc>
       </w:tr>
       <w:tr>
-        <w:tblPrEx>
-          <w:tblCellMar>
-            <w:top w:w="0" w:type="dxa"/>
-            <w:bottom w:w="0" w:type="dxa"/>
-          </w:tblCellMar>
-        </w:tblPrEx>
         <w:tc>
           <w:tcPr>
             <w:tcW w:w="1250" w:type="dxa"/>
@@ -1461,12 +1396,6 @@
         </w:tc>
       </w:tr>
       <w:tr>
-        <w:tblPrEx>
-          <w:tblCellMar>
-            <w:top w:w="0" w:type="dxa"/>
-            <w:bottom w:w="0" w:type="dxa"/>
-          </w:tblCellMar>
-        </w:tblPrEx>
         <w:tc>
           <w:tcPr>
             <w:tcW w:w="1250" w:type="dxa"/>
@@ -1571,12 +1500,6 @@
         </w:tc>
       </w:tr>
       <w:tr>
-        <w:tblPrEx>
-          <w:tblCellMar>
-            <w:top w:w="0" w:type="dxa"/>
-            <w:bottom w:w="0" w:type="dxa"/>
-          </w:tblCellMar>
-        </w:tblPrEx>
         <w:tc>
           <w:tcPr>
             <w:tcW w:w="1250" w:type="dxa"/>
@@ -1681,12 +1604,6 @@
         </w:tc>
       </w:tr>
       <w:tr>
-        <w:tblPrEx>
-          <w:tblCellMar>
-            <w:top w:w="0" w:type="dxa"/>
-            <w:bottom w:w="0" w:type="dxa"/>
-          </w:tblCellMar>
-        </w:tblPrEx>
         <w:tc>
           <w:tcPr>
             <w:tcW w:w="1250" w:type="dxa"/>
@@ -1791,12 +1708,6 @@
         </w:tc>
       </w:tr>
       <w:tr>
-        <w:tblPrEx>
-          <w:tblCellMar>
-            <w:top w:w="0" w:type="dxa"/>
-            <w:bottom w:w="0" w:type="dxa"/>
-          </w:tblCellMar>
-        </w:tblPrEx>
         <w:tc>
           <w:tcPr>
             <w:tcW w:w="1250" w:type="dxa"/>
@@ -1901,12 +1812,6 @@
         </w:tc>
       </w:tr>
       <w:tr>
-        <w:tblPrEx>
-          <w:tblCellMar>
-            <w:top w:w="0" w:type="dxa"/>
-            <w:bottom w:w="0" w:type="dxa"/>
-          </w:tblCellMar>
-        </w:tblPrEx>
         <w:tc>
           <w:tcPr>
             <w:tcW w:w="1250" w:type="dxa"/>
@@ -2011,12 +1916,6 @@
         </w:tc>
       </w:tr>
       <w:tr>
-        <w:tblPrEx>
-          <w:tblCellMar>
-            <w:top w:w="0" w:type="dxa"/>
-            <w:bottom w:w="0" w:type="dxa"/>
-          </w:tblCellMar>
-        </w:tblPrEx>
         <w:tc>
           <w:tcPr>
             <w:tcW w:w="1250" w:type="dxa"/>
@@ -2121,12 +2020,6 @@
         </w:tc>
       </w:tr>
       <w:tr>
-        <w:tblPrEx>
-          <w:tblCellMar>
-            <w:top w:w="0" w:type="dxa"/>
-            <w:bottom w:w="0" w:type="dxa"/>
-          </w:tblCellMar>
-        </w:tblPrEx>
         <w:tc>
           <w:tcPr>
             <w:tcW w:w="1250" w:type="dxa"/>
@@ -2231,12 +2124,6 @@
         </w:tc>
       </w:tr>
       <w:tr>
-        <w:tblPrEx>
-          <w:tblCellMar>
-            <w:top w:w="0" w:type="dxa"/>
-            <w:bottom w:w="0" w:type="dxa"/>
-          </w:tblCellMar>
-        </w:tblPrEx>
         <w:tc>
           <w:tcPr>
             <w:tcW w:w="1250" w:type="dxa"/>
@@ -2352,12 +2239,6 @@
         </w:tc>
       </w:tr>
       <w:tr>
-        <w:tblPrEx>
-          <w:tblCellMar>
-            <w:top w:w="0" w:type="dxa"/>
-            <w:bottom w:w="0" w:type="dxa"/>
-          </w:tblCellMar>
-        </w:tblPrEx>
         <w:tc>
           <w:tcPr>
             <w:tcW w:w="1250" w:type="dxa"/>
@@ -2473,12 +2354,6 @@
         </w:tc>
       </w:tr>
       <w:tr>
-        <w:tblPrEx>
-          <w:tblCellMar>
-            <w:top w:w="0" w:type="dxa"/>
-            <w:bottom w:w="0" w:type="dxa"/>
-          </w:tblCellMar>
-        </w:tblPrEx>
         <w:tc>
           <w:tcPr>
             <w:tcW w:w="1250" w:type="dxa"/>
@@ -2583,12 +2458,6 @@
         </w:tc>
       </w:tr>
       <w:tr>
-        <w:tblPrEx>
-          <w:tblCellMar>
-            <w:top w:w="0" w:type="dxa"/>
-            <w:bottom w:w="0" w:type="dxa"/>
-          </w:tblCellMar>
-        </w:tblPrEx>
         <w:tc>
           <w:tcPr>
             <w:tcW w:w="1250" w:type="dxa"/>
@@ -2693,12 +2562,6 @@
         </w:tc>
       </w:tr>
       <w:tr>
-        <w:tblPrEx>
-          <w:tblCellMar>
-            <w:top w:w="0" w:type="dxa"/>
-            <w:bottom w:w="0" w:type="dxa"/>
-          </w:tblCellMar>
-        </w:tblPrEx>
         <w:tc>
           <w:tcPr>
             <w:tcW w:w="1250" w:type="dxa"/>
@@ -2803,12 +2666,6 @@
         </w:tc>
       </w:tr>
       <w:tr>
-        <w:tblPrEx>
-          <w:tblCellMar>
-            <w:top w:w="0" w:type="dxa"/>
-            <w:bottom w:w="0" w:type="dxa"/>
-          </w:tblCellMar>
-        </w:tblPrEx>
         <w:tc>
           <w:tcPr>
             <w:tcW w:w="1250" w:type="dxa"/>
@@ -2841,25 +2698,7 @@
                 <w:sz w:val="17"/>
                 <w:szCs w:val="17"/>
               </w:rPr>
-              <w:t xml:space="preserve">Licence des logiciels (Microsoft, Office, </w:t>
-            </w:r>
-            <w:proofErr w:type="spellStart"/>
-            <w:r>
-              <w:rPr>
-                <w:color w:val="000000"/>
-                <w:sz w:val="17"/>
-                <w:szCs w:val="17"/>
-              </w:rPr>
-              <w:t>Altium</w:t>
-            </w:r>
-            <w:proofErr w:type="spellEnd"/>
-            <w:r>
-              <w:rPr>
-                <w:color w:val="000000"/>
-                <w:sz w:val="17"/>
-                <w:szCs w:val="17"/>
-              </w:rPr>
-              <w:t>, SolidWorks, etc.)</w:t>
+              <w:t>Licence des logiciels (Microsoft, Office, Altium, SolidWorks, etc.)</w:t>
             </w:r>
           </w:p>
         </w:tc>
@@ -2931,12 +2770,6 @@
         </w:tc>
       </w:tr>
       <w:tr>
-        <w:tblPrEx>
-          <w:tblCellMar>
-            <w:top w:w="0" w:type="dxa"/>
-            <w:bottom w:w="0" w:type="dxa"/>
-          </w:tblCellMar>
-        </w:tblPrEx>
         <w:tc>
           <w:tcPr>
             <w:tcW w:w="1250" w:type="dxa"/>
@@ -3041,12 +2874,6 @@
         </w:tc>
       </w:tr>
       <w:tr>
-        <w:tblPrEx>
-          <w:tblCellMar>
-            <w:top w:w="0" w:type="dxa"/>
-            <w:bottom w:w="0" w:type="dxa"/>
-          </w:tblCellMar>
-        </w:tblPrEx>
         <w:tc>
           <w:tcPr>
             <w:tcW w:w="1250" w:type="dxa"/>
@@ -3151,12 +2978,6 @@
         </w:tc>
       </w:tr>
       <w:tr>
-        <w:tblPrEx>
-          <w:tblCellMar>
-            <w:top w:w="0" w:type="dxa"/>
-            <w:bottom w:w="0" w:type="dxa"/>
-          </w:tblCellMar>
-        </w:tblPrEx>
         <w:tc>
           <w:tcPr>
             <w:tcW w:w="1250" w:type="dxa"/>
@@ -3261,12 +3082,6 @@
         </w:tc>
       </w:tr>
       <w:tr>
-        <w:tblPrEx>
-          <w:tblCellMar>
-            <w:top w:w="0" w:type="dxa"/>
-            <w:bottom w:w="0" w:type="dxa"/>
-          </w:tblCellMar>
-        </w:tblPrEx>
         <w:tc>
           <w:tcPr>
             <w:tcW w:w="1250" w:type="dxa"/>
@@ -3371,12 +3186,6 @@
         </w:tc>
       </w:tr>
       <w:tr>
-        <w:tblPrEx>
-          <w:tblCellMar>
-            <w:top w:w="0" w:type="dxa"/>
-            <w:bottom w:w="0" w:type="dxa"/>
-          </w:tblCellMar>
-        </w:tblPrEx>
         <w:tc>
           <w:tcPr>
             <w:tcW w:w="1250" w:type="dxa"/>
@@ -3481,12 +3290,6 @@
         </w:tc>
       </w:tr>
       <w:tr>
-        <w:tblPrEx>
-          <w:tblCellMar>
-            <w:top w:w="0" w:type="dxa"/>
-            <w:bottom w:w="0" w:type="dxa"/>
-          </w:tblCellMar>
-        </w:tblPrEx>
         <w:tc>
           <w:tcPr>
             <w:tcW w:w="1250" w:type="dxa"/>
@@ -3591,12 +3394,6 @@
         </w:tc>
       </w:tr>
       <w:tr>
-        <w:tblPrEx>
-          <w:tblCellMar>
-            <w:top w:w="0" w:type="dxa"/>
-            <w:bottom w:w="0" w:type="dxa"/>
-          </w:tblCellMar>
-        </w:tblPrEx>
         <w:tc>
           <w:tcPr>
             <w:tcW w:w="1250" w:type="dxa"/>
@@ -3701,12 +3498,6 @@
         </w:tc>
       </w:tr>
       <w:tr>
-        <w:tblPrEx>
-          <w:tblCellMar>
-            <w:top w:w="0" w:type="dxa"/>
-            <w:bottom w:w="0" w:type="dxa"/>
-          </w:tblCellMar>
-        </w:tblPrEx>
         <w:tc>
           <w:tcPr>
             <w:tcW w:w="1250" w:type="dxa"/>
@@ -3811,12 +3602,6 @@
         </w:tc>
       </w:tr>
       <w:tr>
-        <w:tblPrEx>
-          <w:tblCellMar>
-            <w:top w:w="0" w:type="dxa"/>
-            <w:bottom w:w="0" w:type="dxa"/>
-          </w:tblCellMar>
-        </w:tblPrEx>
         <w:tc>
           <w:tcPr>
             <w:tcW w:w="1250" w:type="dxa"/>
@@ -3936,12 +3721,6 @@
         </w:tc>
       </w:tr>
       <w:tr>
-        <w:tblPrEx>
-          <w:tblCellMar>
-            <w:top w:w="0" w:type="dxa"/>
-            <w:bottom w:w="0" w:type="dxa"/>
-          </w:tblCellMar>
-        </w:tblPrEx>
         <w:tc>
           <w:tcPr>
             <w:tcW w:w="1250" w:type="dxa"/>
@@ -4050,12 +3829,6 @@
         </w:tc>
       </w:tr>
       <w:tr>
-        <w:tblPrEx>
-          <w:tblCellMar>
-            <w:top w:w="0" w:type="dxa"/>
-            <w:bottom w:w="0" w:type="dxa"/>
-          </w:tblCellMar>
-        </w:tblPrEx>
         <w:tc>
           <w:tcPr>
             <w:tcW w:w="1250" w:type="dxa"/>
@@ -4160,12 +3933,6 @@
         </w:tc>
       </w:tr>
       <w:tr>
-        <w:tblPrEx>
-          <w:tblCellMar>
-            <w:top w:w="0" w:type="dxa"/>
-            <w:bottom w:w="0" w:type="dxa"/>
-          </w:tblCellMar>
-        </w:tblPrEx>
         <w:tc>
           <w:tcPr>
             <w:tcW w:w="1250" w:type="dxa"/>
@@ -4270,12 +4037,6 @@
         </w:tc>
       </w:tr>
       <w:tr>
-        <w:tblPrEx>
-          <w:tblCellMar>
-            <w:top w:w="0" w:type="dxa"/>
-            <w:bottom w:w="0" w:type="dxa"/>
-          </w:tblCellMar>
-        </w:tblPrEx>
         <w:tc>
           <w:tcPr>
             <w:tcW w:w="1250" w:type="dxa"/>
@@ -4380,12 +4141,6 @@
         </w:tc>
       </w:tr>
       <w:tr>
-        <w:tblPrEx>
-          <w:tblCellMar>
-            <w:top w:w="0" w:type="dxa"/>
-            <w:bottom w:w="0" w:type="dxa"/>
-          </w:tblCellMar>
-        </w:tblPrEx>
         <w:tc>
           <w:tcPr>
             <w:tcW w:w="1250" w:type="dxa"/>
@@ -4578,12 +4333,6 @@
         <w:gridCol w:w="1750"/>
       </w:tblGrid>
       <w:tr>
-        <w:tblPrEx>
-          <w:tblCellMar>
-            <w:top w:w="0" w:type="dxa"/>
-            <w:bottom w:w="0" w:type="dxa"/>
-          </w:tblCellMar>
-        </w:tblPrEx>
         <w:tc>
           <w:tcPr>
             <w:tcW w:w="5200" w:type="dxa"/>
@@ -4661,12 +4410,6 @@
         </w:tc>
       </w:tr>
       <w:tr>
-        <w:tblPrEx>
-          <w:tblCellMar>
-            <w:top w:w="0" w:type="dxa"/>
-            <w:bottom w:w="0" w:type="dxa"/>
-          </w:tblCellMar>
-        </w:tblPrEx>
         <w:tc>
           <w:tcPr>
             <w:tcW w:w="5200" w:type="dxa"/>
@@ -4738,12 +4481,6 @@
         </w:tc>
       </w:tr>
       <w:tr>
-        <w:tblPrEx>
-          <w:tblCellMar>
-            <w:top w:w="0" w:type="dxa"/>
-            <w:bottom w:w="0" w:type="dxa"/>
-          </w:tblCellMar>
-        </w:tblPrEx>
         <w:tc>
           <w:tcPr>
             <w:tcW w:w="5200" w:type="dxa"/>
@@ -4817,12 +4554,6 @@
         </w:tc>
       </w:tr>
       <w:tr>
-        <w:tblPrEx>
-          <w:tblCellMar>
-            <w:top w:w="0" w:type="dxa"/>
-            <w:bottom w:w="0" w:type="dxa"/>
-          </w:tblCellMar>
-        </w:tblPrEx>
         <w:tc>
           <w:tcPr>
             <w:tcW w:w="5200" w:type="dxa"/>
@@ -4934,15 +4665,7 @@
           <w:iCs/>
           <w:color w:val="000000"/>
         </w:rPr>
-        <w:t>L’estimation</w:t>
-      </w:r>
-      <w:r>
-        <w:rPr>
-          <w:i/>
-          <w:iCs/>
-          <w:color w:val="000000"/>
-        </w:rPr>
-        <w:t xml:space="preserve"> analogique (comparaison à des projets comparables déjà réalisés) et l'estimation paramétrique (relation statistique entre historique de coûts et paramètres du projet).</w:t>
+        <w:t>L’estimation analogique (comparaison à des projets comparables déjà réalisés) et l'estimation paramétrique (relation statistique entre historique de coûts et paramètres du projet).</w:t>
       </w:r>
     </w:p>
     <w:p>
@@ -4974,12 +4697,6 @@
         <w:gridCol w:w="2350"/>
       </w:tblGrid>
       <w:tr>
-        <w:tblPrEx>
-          <w:tblCellMar>
-            <w:top w:w="0" w:type="dxa"/>
-            <w:bottom w:w="0" w:type="dxa"/>
-          </w:tblCellMar>
-        </w:tblPrEx>
         <w:tc>
           <w:tcPr>
             <w:tcW w:w="3000" w:type="dxa"/>
@@ -5080,12 +4797,6 @@
         </w:tc>
       </w:tr>
       <w:tr>
-        <w:tblPrEx>
-          <w:tblCellMar>
-            <w:top w:w="0" w:type="dxa"/>
-            <w:bottom w:w="0" w:type="dxa"/>
-          </w:tblCellMar>
-        </w:tblPrEx>
         <w:tc>
           <w:tcPr>
             <w:tcW w:w="3000" w:type="dxa"/>
@@ -5180,12 +4891,6 @@
         </w:tc>
       </w:tr>
       <w:tr>
-        <w:tblPrEx>
-          <w:tblCellMar>
-            <w:top w:w="0" w:type="dxa"/>
-            <w:bottom w:w="0" w:type="dxa"/>
-          </w:tblCellMar>
-        </w:tblPrEx>
         <w:tc>
           <w:tcPr>
             <w:tcW w:w="3000" w:type="dxa"/>
@@ -5278,12 +4983,6 @@
         </w:tc>
       </w:tr>
       <w:tr>
-        <w:tblPrEx>
-          <w:tblCellMar>
-            <w:top w:w="0" w:type="dxa"/>
-            <w:bottom w:w="0" w:type="dxa"/>
-          </w:tblCellMar>
-        </w:tblPrEx>
         <w:tc>
           <w:tcPr>
             <w:tcW w:w="3000" w:type="dxa"/>
@@ -5376,12 +5075,6 @@
         </w:tc>
       </w:tr>
       <w:tr>
-        <w:tblPrEx>
-          <w:tblCellMar>
-            <w:top w:w="0" w:type="dxa"/>
-            <w:bottom w:w="0" w:type="dxa"/>
-          </w:tblCellMar>
-        </w:tblPrEx>
         <w:tc>
           <w:tcPr>
             <w:tcW w:w="3000" w:type="dxa"/>
@@ -5583,12 +5276,6 @@
         <w:gridCol w:w="4150"/>
       </w:tblGrid>
       <w:tr>
-        <w:tblPrEx>
-          <w:tblCellMar>
-            <w:top w:w="0" w:type="dxa"/>
-            <w:bottom w:w="0" w:type="dxa"/>
-          </w:tblCellMar>
-        </w:tblPrEx>
         <w:tc>
           <w:tcPr>
             <w:tcW w:w="5200" w:type="dxa"/>
@@ -5640,12 +5327,6 @@
         </w:tc>
       </w:tr>
       <w:tr>
-        <w:tblPrEx>
-          <w:tblCellMar>
-            <w:top w:w="0" w:type="dxa"/>
-            <w:bottom w:w="0" w:type="dxa"/>
-          </w:tblCellMar>
-        </w:tblPrEx>
         <w:tc>
           <w:tcPr>
             <w:tcW w:w="5200" w:type="dxa"/>
@@ -5693,12 +5374,6 @@
         </w:tc>
       </w:tr>
       <w:tr>
-        <w:tblPrEx>
-          <w:tblCellMar>
-            <w:top w:w="0" w:type="dxa"/>
-            <w:bottom w:w="0" w:type="dxa"/>
-          </w:tblCellMar>
-        </w:tblPrEx>
         <w:tc>
           <w:tcPr>
             <w:tcW w:w="5200" w:type="dxa"/>
@@ -5746,12 +5421,6 @@
         </w:tc>
       </w:tr>
       <w:tr>
-        <w:tblPrEx>
-          <w:tblCellMar>
-            <w:top w:w="0" w:type="dxa"/>
-            <w:bottom w:w="0" w:type="dxa"/>
-          </w:tblCellMar>
-        </w:tblPrEx>
         <w:tc>
           <w:tcPr>
             <w:tcW w:w="5200" w:type="dxa"/>
@@ -5799,12 +5468,6 @@
         </w:tc>
       </w:tr>
       <w:tr>
-        <w:tblPrEx>
-          <w:tblCellMar>
-            <w:top w:w="0" w:type="dxa"/>
-            <w:bottom w:w="0" w:type="dxa"/>
-          </w:tblCellMar>
-        </w:tblPrEx>
         <w:tc>
           <w:tcPr>
             <w:tcW w:w="5200" w:type="dxa"/>
@@ -5852,12 +5515,6 @@
         </w:tc>
       </w:tr>
       <w:tr>
-        <w:tblPrEx>
-          <w:tblCellMar>
-            <w:top w:w="0" w:type="dxa"/>
-            <w:bottom w:w="0" w:type="dxa"/>
-          </w:tblCellMar>
-        </w:tblPrEx>
         <w:tc>
           <w:tcPr>
             <w:tcW w:w="5200" w:type="dxa"/>
@@ -5922,12 +5579,6 @@
         </w:tc>
       </w:tr>
       <w:tr>
-        <w:tblPrEx>
-          <w:tblCellMar>
-            <w:top w:w="0" w:type="dxa"/>
-            <w:bottom w:w="0" w:type="dxa"/>
-          </w:tblCellMar>
-        </w:tblPrEx>
         <w:tc>
           <w:tcPr>
             <w:tcW w:w="5200" w:type="dxa"/>
@@ -6002,28 +5653,8 @@
         <w:rPr>
           <w:color w:val="000000"/>
         </w:rPr>
-        <w:t>L'estimé initial total du mandat s'élève à 46 200,00 $, entièrement composé de main-d'œuvre d'ingénierie (aucun coût matériel ou indirect n'étant applicable à ce projet logiciel académique). Cette estimation, validée par convergence de trois méthodes indépendantes, constitue la base de référence</w:t>
+        <w:t>L’estimé initial total du mandat s’élève à 46 200 $, comprenant 40 000 $ de coûts directs de main-d’œuvre, une contingence de 4 000 $ et une réserve du propriétaire de 2 200 $. Aucun coût matériel ou autre coût direct n’est actuellement imputé au projet. Cette estimation constitue la base de référence budgétaire du mandat.</w:t>
       </w:r>
-      <w:r>
-        <w:rPr>
-          <w:color w:val="000000"/>
-        </w:rPr>
-        <w:t>.</w:t>
-      </w:r>
-      <w:r>
-        <w:rPr>
-          <w:color w:val="000000"/>
-        </w:rPr>
-        <w:t xml:space="preserve"> </w:t>
-      </w:r>
-    </w:p>
-    <w:p>
-      <w:pPr>
-        <w:spacing w:after="160"/>
-        <w:rPr>
-          <w:color w:val="000000"/>
-        </w:rPr>
-      </w:pPr>
     </w:p>
     <w:p>
       <w:pPr>
@@ -6075,13 +5706,7 @@
         <w:spacing w:after="160"/>
       </w:pPr>
       <w:r>
-        <w:t>Classe 4</w:t>
-      </w:r>
-      <w:r>
-        <w:t xml:space="preserve"> : </w:t>
-      </w:r>
-      <w:r>
-        <w:t>environ 2-15 % du projet défini</w:t>
+        <w:t>Classe 4 : environ 2-15 % du projet défini</w:t>
       </w:r>
     </w:p>
     <w:p>
@@ -6089,13 +5714,7 @@
         <w:spacing w:after="160"/>
       </w:pPr>
       <w:r>
-        <w:t>Jalon</w:t>
-      </w:r>
-      <w:r>
-        <w:t xml:space="preserve"> : </w:t>
-      </w:r>
-      <w:r>
-        <w:t>est un point de contrôle formel dans l'échéancier où on vérifie qu'une étape clé est terminée avant de continuer.</w:t>
+        <w:t>Jalon : est un point de contrôle formel dans l'échéancier où on vérifie qu'une étape clé est terminée avant de continuer.</w:t>
       </w:r>
     </w:p>
     <w:p>
@@ -6103,38 +5722,7 @@
         <w:spacing w:after="160"/>
       </w:pPr>
       <w:r>
-        <w:t>Lots</w:t>
-      </w:r>
-      <w:r>
-        <w:t xml:space="preserve"> : </w:t>
-      </w:r>
-    </w:p>
-    <w:p>
-      <w:pPr>
-        <w:spacing w:after="160"/>
-      </w:pPr>
-      <w:r>
-        <w:t xml:space="preserve">          </w:t>
-      </w:r>
-      <w:proofErr w:type="gramStart"/>
-      <w:r>
-        <w:t>est</w:t>
-      </w:r>
-      <w:proofErr w:type="gramEnd"/>
-      <w:r>
-        <w:t xml:space="preserve"> un bloc de travail bien délimité dans la structure de découpage du proje</w:t>
-      </w:r>
-      <w:r>
-        <w:t xml:space="preserve">t, </w:t>
-      </w:r>
-      <w:r>
-        <w:t xml:space="preserve">une façon de diviser un gros projet en </w:t>
-      </w:r>
-      <w:r>
-        <w:t xml:space="preserve">    </w:t>
-      </w:r>
-      <w:r>
-        <w:t>morceaux gérables, chacun avec ses propres heures et son propre responsable. On leur donne des numéros (L1, L2, L3...) pour y référer facilement.</w:t>
+        <w:t>Lots :  est un bloc de travail bien délimité dans la structure de découpage du projet, une façon de diviser un gros projet en     morceaux gérables, chacun avec ses propres heures et son propre responsable. On leur donne des numéros (L1, L2, L3...) pour y référer facilement.</w:t>
       </w:r>
     </w:p>
     <w:sectPr>

</xml_diff>